<commit_message>
Fix IP ownership clause in Curriculum Development MOU to match JV Agreement
Javon's MOU draft (Exhibit A) stated Builder Tech as sole owner of
curriculum with a license back to VoltPop/Explay, contradicting the
joint-ownership resolution in the Joint Venture Agreement draft.
Confirmed by Javon and VoltPop together: curriculum IP is jointly and
equally owned by Builder Tech, VoltPop, and Explay.

Co-Authored-By: Claude Sonnet 5 <noreply@anthropic.com>
</commit_message>
<xml_diff>
--- a/Files/Curriculum Development MOU Draft.docx
+++ b/Files/Curriculum Development MOU Draft.docx
@@ -286,7 +286,7 @@
         <w:rPr>
           <w:rFonts w:ascii="Calibri" w:cs="Calibri" w:eastAsia="Calibri" w:hAnsi="Calibri"/>
         </w:rPr>
-        <w:t xml:space="preserve">Unless otherwise specified in a Party's Scope of Work Exhibit, each Party retains ownership of pre-existing intellectual property it brings into the collaboration. Ownership of Curriculum materials developed jointly or specifically under this collaboration is as specified in each Party's Scope of Work Exhibit. Any license of Curriculum materials to a third-party school, institution, or program is addressed separately between the relevant Party and that third party, and is outside the scope of this MOU.</w:t>
+        <w:t>Unless otherwise specified in a Party's Scope of Work Exhibit, each Party retains ownership of pre-existing intellectual property it brings into the collaboration. Curriculum materials developed jointly or specifically under this collaboration are jointly and equally owned (100% combined, in equal undivided shares) by Builder Tech, Voltpop, and Explay together, regardless of which Party's Scope of Work Exhibit the work was performed under. Any license of Curriculum materials to a third-party school, institution, or program is addressed separately among the three Parties and that third party, and is outside the scope of this MOU.</w:t>
       </w:r>
     </w:p>
     <w:p>
@@ -719,7 +719,7 @@
         <w:rPr>
           <w:rFonts w:ascii="Calibri" w:cs="Calibri" w:eastAsia="Calibri" w:hAnsi="Calibri"/>
         </w:rPr>
-        <w:t xml:space="preserve">Builder Tech LLC retains ownership of Curriculum materials developed under this Exhibit. Voltpop and Explay are granted a non-exclusive license to use these materials solely in connection with their supporting roles in the Curriculum. Any separate license of these materials to a third-party school, institution, or program is addressed directly between Builder Tech and that third party, outside this MOU. [Confirm whether license extends to future deployments of the Curriculum.]</w:t>
+        <w:t>Builder Tech, Voltpop, and Explay jointly and equally own (100% combined, in equal undivided shares) all Curriculum materials developed under this Exhibit — not Builder Tech alone, per Section 5 above. Any separate license of these materials to a third-party school, institution, or program is addressed jointly among the three Parties and that third party, outside this MOU. [Confirm whether license extends to future deployments of the Curriculum.]</w:t>
       </w:r>
     </w:p>
     <w:p>

</xml_diff>

<commit_message>
Add Exhibits B (Voltpop) and C (Explay) to the Curriculum Development MOU
Exhibit A (Builder Tech) previously flagged that Voltpop and Explay
still needed their own Scope of Work exhibits in the same format.
Filled those in using each party's actual curriculum-leadership weeks
from Course-Curriculum.md and role/compensation context from
Admin-Business-Legal.md §1/§2. Flagged two open items rather than
guessing: whether the §2 instruction+curriculum compensation figures
have a curriculum-development-specific carve-out, and a mismatch
between Explay's "software/experience design" subject-matter
description in the MOU body versus the business/pitch weeks Explay
actually leads per the curriculum schedule.

Co-Authored-By: Claude Sonnet 5 <noreply@anthropic.com>
</commit_message>
<xml_diff>
--- a/Files/Curriculum Development MOU Draft.docx
+++ b/Files/Curriculum Development MOU Draft.docx
@@ -734,7 +734,459 @@
           <w:sz w:val="20"/>
           <w:szCs w:val="20"/>
         </w:rPr>
-        <w:t xml:space="preserve">[Note: This exhibit currently addresses Builder Tech LLC only. Voltpop and Explay would each attach their own Scope of Work Exhibit (B, C) in the same format, covering their specific deliverables, timeline, and compensation.]</w:t>
+        <w:t xml:space="preserve">[Note: Exhibits B (Voltpop) and C (Explay) added 2026-08-14, per Javon and VoltPop, in the same format as this Exhibit A.]</w:t>
+      </w:r>
+    </w:p>
+    <w:p>
+      <w:pPr>
+        <w:spacing w:after="60"/>
+        <w:jc w:val="center"/>
+      </w:pPr>
+      <w:r>
+        <w:rPr>
+          <w:rFonts w:ascii="Calibri" w:cs="Calibri" w:eastAsia="Calibri" w:hAnsi="Calibri"/>
+          <w:b/>
+          <w:bCs/>
+          <w:sz w:val="28"/>
+          <w:szCs w:val="28"/>
+        </w:rPr>
+        <w:t xml:space="preserve">EXHIBIT B</w:t>
+      </w:r>
+    </w:p>
+    <w:p>
+      <w:pPr>
+        <w:spacing w:after="300"/>
+        <w:jc w:val="center"/>
+      </w:pPr>
+      <w:r>
+        <w:rPr>
+          <w:rFonts w:ascii="Calibri" w:cs="Calibri" w:eastAsia="Calibri" w:hAnsi="Calibri"/>
+          <w:i/>
+          <w:iCs/>
+          <w:sz w:val="24"/>
+          <w:szCs w:val="24"/>
+        </w:rPr>
+        <w:t xml:space="preserve">Scope of Work — Voltpop</w:t>
+      </w:r>
+    </w:p>
+    <w:p>
+      <w:pPr>
+        <w:pStyle w:val="Heading1"/>
+        <w:spacing w:after="140" w:before="280"/>
+      </w:pPr>
+      <w:r>
+        <w:rPr>
+          <w:rFonts w:ascii="Calibri" w:cs="Calibri" w:eastAsia="Calibri" w:hAnsi="Calibri"/>
+          <w:b/>
+          <w:bCs/>
+        </w:rPr>
+        <w:t xml:space="preserve">B1. Role</w:t>
+      </w:r>
+    </w:p>
+    <w:p>
+      <w:pPr>
+        <w:spacing w:after="160" w:line="276"/>
+      </w:pPr>
+      <w:r>
+        <w:rPr>
+          <w:rFonts w:ascii="Calibri" w:cs="Calibri" w:eastAsia="Calibri" w:hAnsi="Calibri"/>
+        </w:rPr>
+        <w:t xml:space="preserve">Voltpop serves as Supporting Partner, providing subject-matter and technical support in applied IoT hardware/engineering, and leading curriculum weeks centered on hardware, firmware, and systems integration, in coordination with Builder Tech and Explay.</w:t>
+      </w:r>
+    </w:p>
+    <w:p>
+      <w:pPr>
+        <w:pStyle w:val="Heading1"/>
+        <w:spacing w:after="140" w:before="280"/>
+      </w:pPr>
+      <w:r>
+        <w:rPr>
+          <w:rFonts w:ascii="Calibri" w:cs="Calibri" w:eastAsia="Calibri" w:hAnsi="Calibri"/>
+          <w:b/>
+          <w:bCs/>
+        </w:rPr>
+        <w:t xml:space="preserve">B2. Deliverables</w:t>
+      </w:r>
+    </w:p>
+    <w:p>
+      <w:pPr>
+        <w:pStyle w:val="ListParagraph"/>
+        <w:numPr>
+          <w:ilvl w:val="0"/>
+          <w:numId w:val="2"/>
+        </w:numPr>
+        <w:spacing w:after="100"/>
+      </w:pPr>
+      <w:r>
+        <w:rPr>
+          <w:rFonts w:ascii="Calibri" w:cs="Calibri" w:eastAsia="Calibri" w:hAnsi="Calibri"/>
+        </w:rPr>
+        <w:t xml:space="preserve">Hardware- and firmware-focused curriculum content and lesson plans (e.g., Systems &amp; IoT; Hardware Setup &amp; Sensor Basics; Data Flow &amp; Systems Architecture; Full Build hardware/MCP integration — see Course-Curriculum.md for the current week-by-week lead assignments)</w:t>
+      </w:r>
+    </w:p>
+    <w:p>
+      <w:pPr>
+        <w:pStyle w:val="ListParagraph"/>
+        <w:numPr>
+          <w:ilvl w:val="0"/>
+          <w:numId w:val="2"/>
+        </w:numPr>
+        <w:spacing w:after="100"/>
+      </w:pPr>
+      <w:r>
+        <w:rPr>
+          <w:rFonts w:ascii="Calibri" w:cs="Calibri" w:eastAsia="Calibri" w:hAnsi="Calibri"/>
+        </w:rPr>
+        <w:t xml:space="preserve">Hardware repo setup and firmware documentation materials</w:t>
+      </w:r>
+    </w:p>
+    <w:p>
+      <w:pPr>
+        <w:pStyle w:val="ListParagraph"/>
+        <w:numPr>
+          <w:ilvl w:val="0"/>
+          <w:numId w:val="2"/>
+        </w:numPr>
+        <w:spacing w:after="100"/>
+      </w:pPr>
+      <w:r>
+        <w:rPr>
+          <w:rFonts w:ascii="Calibri" w:cs="Calibri" w:eastAsia="Calibri" w:hAnsi="Calibri"/>
+        </w:rPr>
+        <w:t xml:space="preserve">System architecture / data-flow diagram materials</w:t>
+      </w:r>
+    </w:p>
+    <w:p>
+      <w:pPr>
+        <w:pStyle w:val="ListParagraph"/>
+        <w:numPr>
+          <w:ilvl w:val="0"/>
+          <w:numId w:val="2"/>
+        </w:numPr>
+        <w:spacing w:after="100"/>
+      </w:pPr>
+      <w:r>
+        <w:rPr>
+          <w:rFonts w:ascii="Calibri" w:cs="Calibri" w:eastAsia="Calibri" w:hAnsi="Calibri"/>
+        </w:rPr>
+        <w:t xml:space="preserve">Technical mentorship and support across Builder Tech's and Explay's lead weeks as needed</w:t>
+      </w:r>
+    </w:p>
+    <w:p>
+      <w:pPr>
+        <w:pStyle w:val="ListParagraph"/>
+        <w:numPr>
+          <w:ilvl w:val="0"/>
+          <w:numId w:val="2"/>
+        </w:numPr>
+        <w:spacing w:after="100"/>
+      </w:pPr>
+      <w:r>
+        <w:rPr>
+          <w:rFonts w:ascii="Calibri" w:cs="Calibri" w:eastAsia="Calibri" w:hAnsi="Calibri"/>
+        </w:rPr>
+        <w:t xml:space="preserve">[Add or edit deliverables as needed]</w:t>
+      </w:r>
+    </w:p>
+    <w:p>
+      <w:pPr>
+        <w:pStyle w:val="Heading1"/>
+        <w:spacing w:after="140" w:before="280"/>
+      </w:pPr>
+      <w:r>
+        <w:rPr>
+          <w:rFonts w:ascii="Calibri" w:cs="Calibri" w:eastAsia="Calibri" w:hAnsi="Calibri"/>
+          <w:b/>
+          <w:bCs/>
+        </w:rPr>
+        <w:t xml:space="preserve">B3. Timeline</w:t>
+      </w:r>
+    </w:p>
+    <w:p>
+      <w:pPr>
+        <w:spacing w:after="160" w:line="276"/>
+      </w:pPr>
+      <w:r>
+        <w:rPr>
+          <w:rFonts w:ascii="Calibri" w:cs="Calibri" w:eastAsia="Calibri" w:hAnsi="Calibri"/>
+        </w:rPr>
+        <w:t xml:space="preserve">[Insert applicable timeline for curriculum development and any specific delivery windows, to be confirmed as the Curriculum is deployed to particular schools, institutions, or programs.]</w:t>
+      </w:r>
+    </w:p>
+    <w:p>
+      <w:pPr>
+        <w:pStyle w:val="Heading1"/>
+        <w:spacing w:after="140" w:before="280"/>
+      </w:pPr>
+      <w:r>
+        <w:rPr>
+          <w:rFonts w:ascii="Calibri" w:cs="Calibri" w:eastAsia="Calibri" w:hAnsi="Calibri"/>
+          <w:b/>
+          <w:bCs/>
+        </w:rPr>
+        <w:t xml:space="preserve">B4. Compensation</w:t>
+      </w:r>
+    </w:p>
+    <w:p>
+      <w:pPr>
+        <w:spacing w:after="160" w:line="276"/>
+      </w:pPr>
+      <w:r>
+        <w:rPr>
+          <w:rFonts w:ascii="Calibri" w:cs="Calibri" w:eastAsia="Calibri" w:hAnsi="Calibri"/>
+        </w:rPr>
+        <w:t xml:space="preserve">[Insert payment structure — e.g., flat fee, per-student rate, or milestone-based payment schedule, plus payment timing/invoicing terms. Note: Admin-Business-Legal.md §2 lists a $70,000 flat fee for Voltpop's combined Engineering &amp; Computer Science Instruction &amp; Curriculum role — whether any portion of that figure is specifically allocated to curriculum-development work under this MOU, versus instructional delivery, is not yet broken out.]</w:t>
+      </w:r>
+    </w:p>
+    <w:p>
+      <w:pPr>
+        <w:pStyle w:val="Heading1"/>
+        <w:spacing w:after="140" w:before="280"/>
+      </w:pPr>
+      <w:r>
+        <w:rPr>
+          <w:rFonts w:ascii="Calibri" w:cs="Calibri" w:eastAsia="Calibri" w:hAnsi="Calibri"/>
+          <w:b/>
+          <w:bCs/>
+        </w:rPr>
+        <w:t xml:space="preserve">B5. Intellectual Property License</w:t>
+      </w:r>
+    </w:p>
+    <w:p>
+      <w:pPr>
+        <w:spacing w:after="160" w:line="276"/>
+      </w:pPr>
+      <w:r>
+        <w:rPr>
+          <w:rFonts w:ascii="Calibri" w:cs="Calibri" w:eastAsia="Calibri" w:hAnsi="Calibri"/>
+        </w:rPr>
+        <w:t>Builder Tech, Voltpop, and Explay jointly and equally own (100% combined, in equal undivided shares) all Curriculum materials developed under this Exhibit, per Section 5 above — not this Party alone. Any separate license of these materials to a third-party school, institution, or program is addressed jointly among the three Parties and that third party, outside this MOU.</w:t>
+      </w:r>
+    </w:p>
+    <w:p>
+      <w:pPr>
+        <w:spacing w:after="60"/>
+        <w:jc w:val="center"/>
+      </w:pPr>
+      <w:r>
+        <w:rPr>
+          <w:rFonts w:ascii="Calibri" w:cs="Calibri" w:eastAsia="Calibri" w:hAnsi="Calibri"/>
+          <w:b/>
+          <w:bCs/>
+          <w:sz w:val="28"/>
+          <w:szCs w:val="28"/>
+        </w:rPr>
+        <w:t xml:space="preserve">EXHIBIT C</w:t>
+      </w:r>
+    </w:p>
+    <w:p>
+      <w:pPr>
+        <w:spacing w:after="300"/>
+        <w:jc w:val="center"/>
+      </w:pPr>
+      <w:r>
+        <w:rPr>
+          <w:rFonts w:ascii="Calibri" w:cs="Calibri" w:eastAsia="Calibri" w:hAnsi="Calibri"/>
+          <w:i/>
+          <w:iCs/>
+          <w:sz w:val="24"/>
+          <w:szCs w:val="24"/>
+        </w:rPr>
+        <w:t xml:space="preserve">Scope of Work — Explay</w:t>
+      </w:r>
+    </w:p>
+    <w:p>
+      <w:pPr>
+        <w:pStyle w:val="Heading1"/>
+        <w:spacing w:after="140" w:before="280"/>
+      </w:pPr>
+      <w:r>
+        <w:rPr>
+          <w:rFonts w:ascii="Calibri" w:cs="Calibri" w:eastAsia="Calibri" w:hAnsi="Calibri"/>
+          <w:b/>
+          <w:bCs/>
+        </w:rPr>
+        <w:t xml:space="preserve">C1. Role</w:t>
+      </w:r>
+    </w:p>
+    <w:p>
+      <w:pPr>
+        <w:spacing w:after="160" w:line="276"/>
+      </w:pPr>
+      <w:r>
+        <w:rPr>
+          <w:rFonts w:ascii="Calibri" w:cs="Calibri" w:eastAsia="Calibri" w:hAnsi="Calibri"/>
+        </w:rPr>
+        <w:t xml:space="preserve">Explay serves as Supporting Partner, providing subject-matter and technical support in applied IoT software/experience design, and leading curriculum weeks centered on business model development, go-to-market, and pitch delivery, in coordination with Builder Tech and Voltpop. [Flagged 2026-08-14: Explay's curriculum-leadership weeks per Course-Curriculum.md (Business Models &amp; Market Fit; Testing &amp; Going Live; Crafting Your Pitch; Practice &amp; Feedback) span more than the "software/experience design" subject-matter description in this MOU's main body — worth reconciling the two descriptions rather than leaving them to quietly disagree.]</w:t>
+      </w:r>
+    </w:p>
+    <w:p>
+      <w:pPr>
+        <w:pStyle w:val="Heading1"/>
+        <w:spacing w:after="140" w:before="280"/>
+      </w:pPr>
+      <w:r>
+        <w:rPr>
+          <w:rFonts w:ascii="Calibri" w:cs="Calibri" w:eastAsia="Calibri" w:hAnsi="Calibri"/>
+          <w:b/>
+          <w:bCs/>
+        </w:rPr>
+        <w:t xml:space="preserve">C2. Deliverables</w:t>
+      </w:r>
+    </w:p>
+    <w:p>
+      <w:pPr>
+        <w:pStyle w:val="ListParagraph"/>
+        <w:numPr>
+          <w:ilvl w:val="0"/>
+          <w:numId w:val="2"/>
+        </w:numPr>
+        <w:spacing w:after="100"/>
+      </w:pPr>
+      <w:r>
+        <w:rPr>
+          <w:rFonts w:ascii="Calibri" w:cs="Calibri" w:eastAsia="Calibri" w:hAnsi="Calibri"/>
+        </w:rPr>
+        <w:t xml:space="preserve">Business-model and go-to-market curriculum content and lesson plans (e.g., Business Models &amp; Market Fit; Full Build Iterations 3 &amp; 4; Testing &amp; Going Live — see Course-Curriculum.md for the current week-by-week lead assignments)</w:t>
+      </w:r>
+    </w:p>
+    <w:p>
+      <w:pPr>
+        <w:pStyle w:val="ListParagraph"/>
+        <w:numPr>
+          <w:ilvl w:val="0"/>
+          <w:numId w:val="2"/>
+        </w:numPr>
+        <w:spacing w:after="100"/>
+      </w:pPr>
+      <w:r>
+        <w:rPr>
+          <w:rFonts w:ascii="Calibri" w:cs="Calibri" w:eastAsia="Calibri" w:hAnsi="Calibri"/>
+        </w:rPr>
+        <w:t xml:space="preserve">Business Model Canvas and Brand Identity materials</w:t>
+      </w:r>
+    </w:p>
+    <w:p>
+      <w:pPr>
+        <w:pStyle w:val="ListParagraph"/>
+        <w:numPr>
+          <w:ilvl w:val="0"/>
+          <w:numId w:val="2"/>
+        </w:numPr>
+        <w:spacing w:after="100"/>
+      </w:pPr>
+      <w:r>
+        <w:rPr>
+          <w:rFonts w:ascii="Calibri" w:cs="Calibri" w:eastAsia="Calibri" w:hAnsi="Calibri"/>
+        </w:rPr>
+        <w:t xml:space="preserve">Go-to-Market Strategy and Live Product/Demo Video materials</w:t>
+      </w:r>
+    </w:p>
+    <w:p>
+      <w:pPr>
+        <w:pStyle w:val="ListParagraph"/>
+        <w:numPr>
+          <w:ilvl w:val="0"/>
+          <w:numId w:val="2"/>
+        </w:numPr>
+        <w:spacing w:after="100"/>
+      </w:pPr>
+      <w:r>
+        <w:rPr>
+          <w:rFonts w:ascii="Calibri" w:cs="Calibri" w:eastAsia="Calibri" w:hAnsi="Calibri"/>
+        </w:rPr>
+        <w:t xml:space="preserve">Pitch Deck Outline/Draft, pitch rehearsal, and peer-review materials</w:t>
+      </w:r>
+    </w:p>
+    <w:p>
+      <w:pPr>
+        <w:pStyle w:val="ListParagraph"/>
+        <w:numPr>
+          <w:ilvl w:val="0"/>
+          <w:numId w:val="2"/>
+        </w:numPr>
+        <w:spacing w:after="100"/>
+      </w:pPr>
+      <w:r>
+        <w:rPr>
+          <w:rFonts w:ascii="Calibri" w:cs="Calibri" w:eastAsia="Calibri" w:hAnsi="Calibri"/>
+        </w:rPr>
+        <w:t xml:space="preserve">[Add or edit deliverables as needed]</w:t>
+      </w:r>
+    </w:p>
+    <w:p>
+      <w:pPr>
+        <w:pStyle w:val="Heading1"/>
+        <w:spacing w:after="140" w:before="280"/>
+      </w:pPr>
+      <w:r>
+        <w:rPr>
+          <w:rFonts w:ascii="Calibri" w:cs="Calibri" w:eastAsia="Calibri" w:hAnsi="Calibri"/>
+          <w:b/>
+          <w:bCs/>
+        </w:rPr>
+        <w:t xml:space="preserve">C3. Timeline</w:t>
+      </w:r>
+    </w:p>
+    <w:p>
+      <w:pPr>
+        <w:spacing w:after="160" w:line="276"/>
+      </w:pPr>
+      <w:r>
+        <w:rPr>
+          <w:rFonts w:ascii="Calibri" w:cs="Calibri" w:eastAsia="Calibri" w:hAnsi="Calibri"/>
+        </w:rPr>
+        <w:t xml:space="preserve">[Insert applicable timeline for curriculum development and any specific delivery windows, to be confirmed as the Curriculum is deployed to particular schools, institutions, or programs.]</w:t>
+      </w:r>
+    </w:p>
+    <w:p>
+      <w:pPr>
+        <w:pStyle w:val="Heading1"/>
+        <w:spacing w:after="140" w:before="280"/>
+      </w:pPr>
+      <w:r>
+        <w:rPr>
+          <w:rFonts w:ascii="Calibri" w:cs="Calibri" w:eastAsia="Calibri" w:hAnsi="Calibri"/>
+          <w:b/>
+          <w:bCs/>
+        </w:rPr>
+        <w:t xml:space="preserve">C4. Compensation</w:t>
+      </w:r>
+    </w:p>
+    <w:p>
+      <w:pPr>
+        <w:spacing w:after="160" w:line="276"/>
+      </w:pPr>
+      <w:r>
+        <w:rPr>
+          <w:rFonts w:ascii="Calibri" w:cs="Calibri" w:eastAsia="Calibri" w:hAnsi="Calibri"/>
+        </w:rPr>
+        <w:t xml:space="preserve">[Insert payment structure — e.g., flat fee, per-student rate, or milestone-based payment schedule, plus payment timing/invoicing terms. Note: Admin-Business-Legal.md §2 lists an $87,500 flat fee for Explay's combined Entrepreneurship &amp; Innovation Instruction &amp; Curriculum role — whether any portion of that figure is specifically allocated to curriculum-development work under this MOU, versus instructional delivery, is not yet broken out.]</w:t>
+      </w:r>
+    </w:p>
+    <w:p>
+      <w:pPr>
+        <w:pStyle w:val="Heading1"/>
+        <w:spacing w:after="140" w:before="280"/>
+      </w:pPr>
+      <w:r>
+        <w:rPr>
+          <w:rFonts w:ascii="Calibri" w:cs="Calibri" w:eastAsia="Calibri" w:hAnsi="Calibri"/>
+          <w:b/>
+          <w:bCs/>
+        </w:rPr>
+        <w:t xml:space="preserve">C5. Intellectual Property License</w:t>
+      </w:r>
+    </w:p>
+    <w:p>
+      <w:pPr>
+        <w:spacing w:after="160" w:line="276"/>
+      </w:pPr>
+      <w:r>
+        <w:rPr>
+          <w:rFonts w:ascii="Calibri" w:cs="Calibri" w:eastAsia="Calibri" w:hAnsi="Calibri"/>
+        </w:rPr>
+        <w:t>Builder Tech, Voltpop, and Explay jointly and equally own (100% combined, in equal undivided shares) all Curriculum materials developed under this Exhibit, per Section 5 above — not this Party alone. Any separate license of these materials to a third-party school, institution, or program is addressed jointly among the three Parties and that third party, outside this MOU.</w:t>
       </w:r>
     </w:p>
     <w:sectPr>

</xml_diff>